<commit_message>
Update Day3 review materials
</commit_message>
<xml_diff>
--- a/可直接打开的Word版/每日笔记__Day02_5月29日_绪论与SPSS入门.docx
+++ b/可直接打开的Word版/每日笔记__Day02_5月29日_绪论与SPSS入门.docx
@@ -4,801 +4,309 @@
   <w:body>
     <w:p>
       <w:pPr>
-        <w:jc w:val="center"/>
+        <w:pStyle w:val="Heading1"/>
+      </w:pPr>
+      <w:r>
+        <w:t>Day02 5月29日 绪论 + SPSS入门</w:t>
+      </w:r>
+    </w:p>
+    <w:p/>
+    <w:p>
+      <w:pPr>
+        <w:pStyle w:val="Heading2"/>
+      </w:pPr>
+      <w:r>
+        <w:t>今日完成</w:t>
+      </w:r>
+    </w:p>
+    <w:p/>
+    <w:p>
+      <w:pPr>
+        <w:pStyle w:val="ListBullet"/>
       </w:pPr>
       <w:r>
         <w:rPr>
           <w:rFonts w:ascii="Microsoft YaHei" w:hAnsi="Microsoft YaHei" w:eastAsia="Microsoft YaHei"/>
-          <w:b/>
-          <w:sz w:val="32"/>
+          <w:sz w:val="22"/>
         </w:rPr>
-        <w:t>医学统计学 Day02 复习笔记：绪论 + SPSS入门</w:t>
-      </w:r>
-    </w:p>
-    <w:p>
-      <w:pPr>
-        <w:spacing w:after="80"/>
-      </w:pPr>
-      <w:r>
-        <w:rPr>
-          <w:rFonts w:ascii="Microsoft YaHei" w:hAnsi="Microsoft YaHei" w:eastAsia="Microsoft YaHei"/>
-          <w:sz w:val="21"/>
-        </w:rPr>
-        <w:t>日期：2026年5月29日    建议用时：1.5-2小时    目标：概念能辨析，SPSS能看懂数据视图和变量视图。</w:t>
-      </w:r>
-    </w:p>
-    <w:p>
-      <w:pPr>
-        <w:pStyle w:val="Heading1"/>
-      </w:pPr>
-      <w:r>
-        <w:rPr>
-          <w:rFonts w:ascii="Microsoft YaHei" w:hAnsi="Microsoft YaHei" w:eastAsia="Microsoft YaHei"/>
-        </w:rPr>
-        <w:t>一、今天必须会的8个概念</w:t>
-      </w:r>
-    </w:p>
-    <w:tbl>
-      <w:tblPr>
-        <w:tblStyle w:val="TableGrid"/>
-        <w:tblW w:type="auto" w:w="0"/>
-        <w:jc w:val="center"/>
-        <w:tblLook w:firstColumn="1" w:firstRow="1" w:lastColumn="0" w:lastRow="0" w:noHBand="0" w:noVBand="1" w:val="04A0"/>
-      </w:tblPr>
-      <w:tblGrid>
-        <w:gridCol w:w="5040"/>
-        <w:gridCol w:w="5040"/>
-      </w:tblGrid>
-      <w:tr>
-        <w:tc>
-          <w:tcPr>
-            <w:tcW w:type="dxa" w:w="5040"/>
-            <w:vAlign w:val="center"/>
-            <w:shd w:fill="D9EAF7"/>
-          </w:tcPr>
-          <w:p>
-            <w:r/>
-            <w:r>
-              <w:rPr>
-                <w:rFonts w:ascii="Microsoft YaHei" w:hAnsi="Microsoft YaHei" w:eastAsia="Microsoft YaHei"/>
-                <w:b/>
-                <w:sz w:val="20"/>
-              </w:rPr>
-              <w:t>概念</w:t>
-            </w:r>
-          </w:p>
-        </w:tc>
-        <w:tc>
-          <w:tcPr>
-            <w:tcW w:type="dxa" w:w="5040"/>
-            <w:vAlign w:val="center"/>
-            <w:shd w:fill="D9EAF7"/>
-          </w:tcPr>
-          <w:p>
-            <w:r/>
-            <w:r>
-              <w:rPr>
-                <w:rFonts w:ascii="Microsoft YaHei" w:hAnsi="Microsoft YaHei" w:eastAsia="Microsoft YaHei"/>
-                <w:b/>
-                <w:sz w:val="20"/>
-              </w:rPr>
-              <w:t>考试版理解</w:t>
-            </w:r>
-          </w:p>
-        </w:tc>
-      </w:tr>
-      <w:tr>
-        <w:tc>
-          <w:tcPr>
-            <w:tcW w:type="dxa" w:w="5040"/>
-            <w:vAlign w:val="center"/>
-          </w:tcPr>
-          <w:p>
-            <w:r/>
-            <w:r>
-              <w:rPr>
-                <w:rFonts w:ascii="Microsoft YaHei" w:hAnsi="Microsoft YaHei" w:eastAsia="Microsoft YaHei"/>
-                <w:b/>
-                <w:sz w:val="20"/>
-              </w:rPr>
-              <w:t>总体</w:t>
-            </w:r>
-          </w:p>
-        </w:tc>
-        <w:tc>
-          <w:tcPr>
-            <w:tcW w:type="dxa" w:w="5040"/>
-            <w:vAlign w:val="center"/>
-          </w:tcPr>
-          <w:p>
-            <w:r/>
-            <w:r>
-              <w:rPr>
-                <w:rFonts w:ascii="Microsoft YaHei" w:hAnsi="Microsoft YaHei" w:eastAsia="Microsoft YaHei"/>
-                <w:b w:val="0"/>
-                <w:sz w:val="20"/>
-              </w:rPr>
-              <w:t>根据研究目的确定的全部同质观察单位或其观察值。题目问“研究某地健康成年男性血红蛋白参考值范围”，总体应是“该地所有健康成年男性的血红蛋白值”。</w:t>
-            </w:r>
-          </w:p>
-        </w:tc>
-      </w:tr>
-      <w:tr>
-        <w:tc>
-          <w:tcPr>
-            <w:tcW w:type="dxa" w:w="5040"/>
-            <w:vAlign w:val="center"/>
-          </w:tcPr>
-          <w:p>
-            <w:r/>
-            <w:r>
-              <w:rPr>
-                <w:rFonts w:ascii="Microsoft YaHei" w:hAnsi="Microsoft YaHei" w:eastAsia="Microsoft YaHei"/>
-                <w:b/>
-                <w:sz w:val="20"/>
-              </w:rPr>
-              <w:t>样本</w:t>
-            </w:r>
-          </w:p>
-        </w:tc>
-        <w:tc>
-          <w:tcPr>
-            <w:tcW w:type="dxa" w:w="5040"/>
-            <w:vAlign w:val="center"/>
-          </w:tcPr>
-          <w:p>
-            <w:r/>
-            <w:r>
-              <w:rPr>
-                <w:rFonts w:ascii="Microsoft YaHei" w:hAnsi="Microsoft YaHei" w:eastAsia="Microsoft YaHei"/>
-                <w:b w:val="0"/>
-                <w:sz w:val="20"/>
-              </w:rPr>
-              <w:t>从总体中随机抽取的一部分观察单位或观察值。样本用来代表总体。</w:t>
-            </w:r>
-          </w:p>
-        </w:tc>
-      </w:tr>
-      <w:tr>
-        <w:tc>
-          <w:tcPr>
-            <w:tcW w:type="dxa" w:w="5040"/>
-            <w:vAlign w:val="center"/>
-          </w:tcPr>
-          <w:p>
-            <w:r/>
-            <w:r>
-              <w:rPr>
-                <w:rFonts w:ascii="Microsoft YaHei" w:hAnsi="Microsoft YaHei" w:eastAsia="Microsoft YaHei"/>
-                <w:b/>
-                <w:sz w:val="20"/>
-              </w:rPr>
-              <w:t>参数</w:t>
-            </w:r>
-          </w:p>
-        </w:tc>
-        <w:tc>
-          <w:tcPr>
-            <w:tcW w:type="dxa" w:w="5040"/>
-            <w:vAlign w:val="center"/>
-          </w:tcPr>
-          <w:p>
-            <w:r/>
-            <w:r>
-              <w:rPr>
-                <w:rFonts w:ascii="Microsoft YaHei" w:hAnsi="Microsoft YaHei" w:eastAsia="Microsoft YaHei"/>
-                <w:b w:val="0"/>
-                <w:sz w:val="20"/>
-              </w:rPr>
-              <w:t>描述总体特征的指标，如总体均数 μ、总体率 π，通常未知。</w:t>
-            </w:r>
-          </w:p>
-        </w:tc>
-      </w:tr>
-      <w:tr>
-        <w:tc>
-          <w:tcPr>
-            <w:tcW w:type="dxa" w:w="5040"/>
-            <w:vAlign w:val="center"/>
-          </w:tcPr>
-          <w:p>
-            <w:r/>
-            <w:r>
-              <w:rPr>
-                <w:rFonts w:ascii="Microsoft YaHei" w:hAnsi="Microsoft YaHei" w:eastAsia="Microsoft YaHei"/>
-                <w:b/>
-                <w:sz w:val="20"/>
-              </w:rPr>
-              <w:t>统计量</w:t>
-            </w:r>
-          </w:p>
-        </w:tc>
-        <w:tc>
-          <w:tcPr>
-            <w:tcW w:type="dxa" w:w="5040"/>
-            <w:vAlign w:val="center"/>
-          </w:tcPr>
-          <w:p>
-            <w:r/>
-            <w:r>
-              <w:rPr>
-                <w:rFonts w:ascii="Microsoft YaHei" w:hAnsi="Microsoft YaHei" w:eastAsia="Microsoft YaHei"/>
-                <w:b w:val="0"/>
-                <w:sz w:val="20"/>
-              </w:rPr>
-              <w:t>由样本资料计算出的指标，如样本均数 x̄、样本率 p，用来估计参数。</w:t>
-            </w:r>
-          </w:p>
-        </w:tc>
-      </w:tr>
-      <w:tr>
-        <w:tc>
-          <w:tcPr>
-            <w:tcW w:type="dxa" w:w="5040"/>
-            <w:vAlign w:val="center"/>
-          </w:tcPr>
-          <w:p>
-            <w:r/>
-            <w:r>
-              <w:rPr>
-                <w:rFonts w:ascii="Microsoft YaHei" w:hAnsi="Microsoft YaHei" w:eastAsia="Microsoft YaHei"/>
-                <w:b/>
-                <w:sz w:val="20"/>
-              </w:rPr>
-              <w:t>同质</w:t>
-            </w:r>
-          </w:p>
-        </w:tc>
-        <w:tc>
-          <w:tcPr>
-            <w:tcW w:type="dxa" w:w="5040"/>
-            <w:vAlign w:val="center"/>
-          </w:tcPr>
-          <w:p>
-            <w:r/>
-            <w:r>
-              <w:rPr>
-                <w:rFonts w:ascii="Microsoft YaHei" w:hAnsi="Microsoft YaHei" w:eastAsia="Microsoft YaHei"/>
-                <w:b w:val="0"/>
-                <w:sz w:val="20"/>
-              </w:rPr>
-              <w:t>对研究指标有影响的主要因素相同或相近，不要求完全相同。</w:t>
-            </w:r>
-          </w:p>
-        </w:tc>
-      </w:tr>
-      <w:tr>
-        <w:tc>
-          <w:tcPr>
-            <w:tcW w:type="dxa" w:w="5040"/>
-            <w:vAlign w:val="center"/>
-          </w:tcPr>
-          <w:p>
-            <w:r/>
-            <w:r>
-              <w:rPr>
-                <w:rFonts w:ascii="Microsoft YaHei" w:hAnsi="Microsoft YaHei" w:eastAsia="Microsoft YaHei"/>
-                <w:b/>
-                <w:sz w:val="20"/>
-              </w:rPr>
-              <w:t>随机</w:t>
-            </w:r>
-          </w:p>
-        </w:tc>
-        <w:tc>
-          <w:tcPr>
-            <w:tcW w:type="dxa" w:w="5040"/>
-            <w:vAlign w:val="center"/>
-          </w:tcPr>
-          <w:p>
-            <w:r/>
-            <w:r>
-              <w:rPr>
-                <w:rFonts w:ascii="Microsoft YaHei" w:hAnsi="Microsoft YaHei" w:eastAsia="Microsoft YaHei"/>
-                <w:b w:val="0"/>
-                <w:sz w:val="20"/>
-              </w:rPr>
-              <w:t>总体中每个观察单位都有同等或可知的机会被抽中，用来减少选择偏倚。</w:t>
-            </w:r>
-          </w:p>
-        </w:tc>
-      </w:tr>
-      <w:tr>
-        <w:tc>
-          <w:tcPr>
-            <w:tcW w:type="dxa" w:w="5040"/>
-            <w:vAlign w:val="center"/>
-          </w:tcPr>
-          <w:p>
-            <w:r/>
-            <w:r>
-              <w:rPr>
-                <w:rFonts w:ascii="Microsoft YaHei" w:hAnsi="Microsoft YaHei" w:eastAsia="Microsoft YaHei"/>
-                <w:b/>
-                <w:sz w:val="20"/>
-              </w:rPr>
-              <w:t>抽样误差</w:t>
-            </w:r>
-          </w:p>
-        </w:tc>
-        <w:tc>
-          <w:tcPr>
-            <w:tcW w:type="dxa" w:w="5040"/>
-            <w:vAlign w:val="center"/>
-          </w:tcPr>
-          <w:p>
-            <w:r/>
-            <w:r>
-              <w:rPr>
-                <w:rFonts w:ascii="Microsoft YaHei" w:hAnsi="Microsoft YaHei" w:eastAsia="Microsoft YaHei"/>
-                <w:b w:val="0"/>
-                <w:sz w:val="20"/>
-              </w:rPr>
-              <w:t>由随机抽样导致的样本统计量与总体参数之间的差异，不可完全避免，但可通过增大样本量减小。</w:t>
-            </w:r>
-          </w:p>
-        </w:tc>
-      </w:tr>
-      <w:tr>
-        <w:tc>
-          <w:tcPr>
-            <w:tcW w:type="dxa" w:w="5040"/>
-            <w:vAlign w:val="center"/>
-          </w:tcPr>
-          <w:p>
-            <w:r/>
-            <w:r>
-              <w:rPr>
-                <w:rFonts w:ascii="Microsoft YaHei" w:hAnsi="Microsoft YaHei" w:eastAsia="Microsoft YaHei"/>
-                <w:b/>
-                <w:sz w:val="20"/>
-              </w:rPr>
-              <w:t>系统误差</w:t>
-            </w:r>
-          </w:p>
-        </w:tc>
-        <w:tc>
-          <w:tcPr>
-            <w:tcW w:type="dxa" w:w="5040"/>
-            <w:vAlign w:val="center"/>
-          </w:tcPr>
-          <w:p>
-            <w:r/>
-            <w:r>
-              <w:rPr>
-                <w:rFonts w:ascii="Microsoft YaHei" w:hAnsi="Microsoft YaHei" w:eastAsia="Microsoft YaHei"/>
-                <w:b w:val="0"/>
-                <w:sz w:val="20"/>
-              </w:rPr>
-              <w:t>由设计、测量、选择、混杂等固定方向因素造成的偏差，原则上可通过严格设计和质量控制减少或避免。</w:t>
-            </w:r>
-          </w:p>
-        </w:tc>
-      </w:tr>
-    </w:tbl>
-    <w:p>
-      <w:pPr>
-        <w:pStyle w:val="Heading1"/>
-      </w:pPr>
-      <w:r>
-        <w:rPr>
-          <w:rFonts w:ascii="Microsoft YaHei" w:hAnsi="Microsoft YaHei" w:eastAsia="Microsoft YaHei"/>
-        </w:rPr>
-        <w:t>二、绪论10题答案与逐题讲解</w:t>
-      </w:r>
-    </w:p>
-    <w:p>
-      <w:pPr>
-        <w:spacing w:after="80"/>
-      </w:pPr>
-      <w:r>
-        <w:rPr>
-          <w:rFonts w:ascii="Microsoft YaHei" w:hAnsi="Microsoft YaHei" w:eastAsia="Microsoft YaHei"/>
-          <w:sz w:val="21"/>
-        </w:rPr>
-        <w:t>1. 答案：B。总体首先要求同质，即研究对象在影响研究指标的主要因素上相同或相近。有限、大量不是总体的必要条件；随机是抽样原则。</w:t>
-      </w:r>
-    </w:p>
-    <w:p>
-      <w:pPr>
-        <w:spacing w:after="80"/>
-      </w:pPr>
-      <w:r>
-        <w:rPr>
-          <w:rFonts w:ascii="Microsoft YaHei" w:hAnsi="Microsoft YaHei" w:eastAsia="Microsoft YaHei"/>
-          <w:sz w:val="21"/>
-        </w:rPr>
-        <w:t>2. 答案：A。同质不是完全一样，而是“影响研究指标的因素相同或相近”。医学研究中个体差异客观存在。</w:t>
-      </w:r>
-    </w:p>
-    <w:p>
-      <w:pPr>
-        <w:spacing w:after="80"/>
-      </w:pPr>
-      <w:r>
-        <w:rPr>
-          <w:rFonts w:ascii="Microsoft YaHei" w:hAnsi="Microsoft YaHei" w:eastAsia="Microsoft YaHei"/>
-          <w:sz w:val="21"/>
-        </w:rPr>
-        <w:t>3. 答案：D。抽样的核心目的不是研究样本本身，而是由样本统计量推断总体参数。</w:t>
-      </w:r>
-    </w:p>
-    <w:p>
-      <w:pPr>
-        <w:spacing w:after="80"/>
-      </w:pPr>
-      <w:r>
-        <w:rPr>
-          <w:rFonts w:ascii="Microsoft YaHei" w:hAnsi="Microsoft YaHei" w:eastAsia="Microsoft YaHei"/>
-          <w:sz w:val="21"/>
-        </w:rPr>
-        <w:t>4. 答案：C。抽样误差就是样本统计量与总体参数之间的差异。它来自随机抽样，不是测量错误。</w:t>
-      </w:r>
-    </w:p>
-    <w:p>
-      <w:pPr>
-        <w:spacing w:after="80"/>
-      </w:pPr>
-      <w:r>
-        <w:rPr>
-          <w:rFonts w:ascii="Microsoft YaHei" w:hAnsi="Microsoft YaHei" w:eastAsia="Microsoft YaHei"/>
-          <w:sz w:val="21"/>
-        </w:rPr>
-        <w:t>5. 答案：C。研究对象限定为“该地健康成年男性”，指标是“血红蛋白值”，所以总体是该地所有健康成年男性的血红蛋白值。</w:t>
-      </w:r>
-    </w:p>
-    <w:p>
-      <w:pPr>
-        <w:spacing w:after="80"/>
-      </w:pPr>
-      <w:r>
-        <w:rPr>
-          <w:rFonts w:ascii="Microsoft YaHei" w:hAnsi="Microsoft YaHei" w:eastAsia="Microsoft YaHei"/>
-          <w:sz w:val="21"/>
-        </w:rPr>
-        <w:t>6. 答案：C。研究的是“采用某新疗法治疗糖尿病患者”的血糖结果，故总体应推广到接受该新疗法的所有糖尿病患者的血糖值。</w:t>
-      </w:r>
-    </w:p>
-    <w:p>
-      <w:pPr>
-        <w:spacing w:after="80"/>
-      </w:pPr>
-      <w:r>
-        <w:rPr>
-          <w:rFonts w:ascii="Microsoft YaHei" w:hAnsi="Microsoft YaHei" w:eastAsia="Microsoft YaHei"/>
-          <w:sz w:val="21"/>
-        </w:rPr>
-        <w:t>7. 答案：C。概率描述随机事件发生可能性的大小，不是“某样本事件发生的强度”。频率在样本量足够大时趋近概率。</w:t>
-      </w:r>
-    </w:p>
-    <w:p>
-      <w:pPr>
-        <w:spacing w:after="80"/>
-      </w:pPr>
-      <w:r>
-        <w:rPr>
-          <w:rFonts w:ascii="Microsoft YaHei" w:hAnsi="Microsoft YaHei" w:eastAsia="Microsoft YaHei"/>
-          <w:sz w:val="21"/>
-        </w:rPr>
-        <w:t>8. 答案：C。测量误差和抽样误差难以完全避免；系统误差可通过设计和质控尽量避免或减少。</w:t>
-      </w:r>
-    </w:p>
-    <w:p>
-      <w:pPr>
-        <w:spacing w:after="80"/>
-      </w:pPr>
-      <w:r>
-        <w:rPr>
-          <w:rFonts w:ascii="Microsoft YaHei" w:hAnsi="Microsoft YaHei" w:eastAsia="Microsoft YaHei"/>
-          <w:sz w:val="21"/>
-        </w:rPr>
-        <w:t>9. 答案：D。统计分析主要包括统计描述和统计推断。描述是整理现有资料，推断是由样本推总体。</w:t>
-      </w:r>
-    </w:p>
-    <w:p>
-      <w:pPr>
-        <w:spacing w:after="80"/>
-      </w:pPr>
-      <w:r>
-        <w:rPr>
-          <w:rFonts w:ascii="Microsoft YaHei" w:hAnsi="Microsoft YaHei" w:eastAsia="Microsoft YaHei"/>
-          <w:sz w:val="21"/>
-        </w:rPr>
-        <w:t>10. 答案：C。统计工作基本步骤：研究设计、搜集资料、整理资料、分析资料。调查和试验只是搜集资料的方式。</w:t>
-      </w:r>
-    </w:p>
-    <w:p>
-      <w:pPr>
-        <w:pStyle w:val="Heading1"/>
-      </w:pPr>
-      <w:r>
-        <w:rPr>
-          <w:rFonts w:ascii="Microsoft YaHei" w:hAnsi="Microsoft YaHei" w:eastAsia="Microsoft YaHei"/>
-        </w:rPr>
-        <w:t>三、SPSS入门：今天只抓这5件事</w:t>
+        <w:t>绪论10道选择题已完成，最终全部理解。</w:t>
       </w:r>
     </w:p>
     <w:p>
       <w:pPr>
         <w:pStyle w:val="ListBullet"/>
-        <w:spacing w:after="40"/>
       </w:pPr>
       <w:r>
         <w:rPr>
           <w:rFonts w:ascii="Microsoft YaHei" w:hAnsi="Microsoft YaHei" w:eastAsia="Microsoft YaHei"/>
-          <w:sz w:val="21"/>
+          <w:sz w:val="22"/>
         </w:rPr>
-        <w:t>数据视图 Data View：像表格。一行=一个研究对象；一列=一个变量；单元格=该对象在该变量上的取值。</w:t>
+        <w:t>已掌握：总体、样本、参数、统计量、同质、随机、抽样误差、系统误差。</w:t>
       </w:r>
     </w:p>
     <w:p>
       <w:pPr>
         <w:pStyle w:val="ListBullet"/>
-        <w:spacing w:after="40"/>
       </w:pPr>
       <w:r>
         <w:rPr>
           <w:rFonts w:ascii="Microsoft YaHei" w:hAnsi="Microsoft YaHei" w:eastAsia="Microsoft YaHei"/>
-          <w:sz w:val="21"/>
+          <w:sz w:val="22"/>
         </w:rPr>
-        <w:t>变量视图 Variable View：定义每一列变量的属性。今天重点看 Name、Type、Label、Values、Measure。</w:t>
+        <w:t>已熟悉 SPSS 中文界面里“测量”的三个选项：标度、有序、名义。</w:t>
+      </w:r>
+    </w:p>
+    <w:p/>
+    <w:p>
+      <w:pPr>
+        <w:pStyle w:val="Heading2"/>
+      </w:pPr>
+      <w:r>
+        <w:t>今日错题</w:t>
+      </w:r>
+    </w:p>
+    <w:p/>
+    <w:p>
+      <w:r>
+        <w:rPr>
+          <w:rFonts w:ascii="Microsoft YaHei" w:hAnsi="Microsoft YaHei" w:eastAsia="Microsoft YaHei"/>
+          <w:sz w:val="22"/>
+        </w:rPr>
+        <w:t>错题：2、4、7、8、10。</w:t>
+      </w:r>
+    </w:p>
+    <w:p/>
+    <w:p>
+      <w:pPr>
+        <w:pStyle w:val="ListBullet"/>
+      </w:pPr>
+      <w:r>
+        <w:rPr>
+          <w:rFonts w:ascii="Microsoft YaHei" w:hAnsi="Microsoft YaHei" w:eastAsia="Microsoft YaHei"/>
+          <w:sz w:val="22"/>
+        </w:rPr>
+        <w:t>2题：同质不是完全相同，而是影响研究指标的主要因素相同或相近。</w:t>
       </w:r>
     </w:p>
     <w:p>
       <w:pPr>
         <w:pStyle w:val="ListBullet"/>
-        <w:spacing w:after="40"/>
       </w:pPr>
       <w:r>
         <w:rPr>
           <w:rFonts w:ascii="Microsoft YaHei" w:hAnsi="Microsoft YaHei" w:eastAsia="Microsoft YaHei"/>
-          <w:sz w:val="21"/>
+          <w:sz w:val="22"/>
         </w:rPr>
-        <w:t>变量标签 Label：变量的中文说明。例如 Name 写 hgb，Label 写“血红蛋白”。</w:t>
+        <w:t>4题：抽样误差是样本统计量与总体参数之间的差异，不是某个个体与均数的差。</w:t>
       </w:r>
     </w:p>
     <w:p>
       <w:pPr>
         <w:pStyle w:val="ListBullet"/>
-        <w:spacing w:after="40"/>
       </w:pPr>
       <w:r>
         <w:rPr>
           <w:rFonts w:ascii="Microsoft YaHei" w:hAnsi="Microsoft YaHei" w:eastAsia="Microsoft YaHei"/>
-          <w:sz w:val="21"/>
+          <w:sz w:val="22"/>
         </w:rPr>
-        <w:t>值标签 Values：分类变量的编码说明。例如 sex：1=男，2=女；group：1=治疗组，2=对照组。</w:t>
+        <w:t>7题：概率描述随机事件发生可能性的大小，不是“强度”。</w:t>
       </w:r>
     </w:p>
     <w:p>
       <w:pPr>
         <w:pStyle w:val="ListBullet"/>
-        <w:spacing w:after="40"/>
       </w:pPr>
       <w:r>
         <w:rPr>
           <w:rFonts w:ascii="Microsoft YaHei" w:hAnsi="Microsoft YaHei" w:eastAsia="Microsoft YaHei"/>
-          <w:sz w:val="21"/>
+          <w:sz w:val="22"/>
         </w:rPr>
-        <w:t>Measure：Scale=计量资料；Nominal=无序分类；Ordinal=等级资料。考试常从这里判断资料类型。</w:t>
-      </w:r>
-    </w:p>
-    <w:p>
-      <w:pPr>
-        <w:spacing w:after="80"/>
-      </w:pPr>
-      <w:r>
-        <w:rPr>
-          <w:rFonts w:ascii="Microsoft YaHei" w:hAnsi="Microsoft YaHei" w:eastAsia="Microsoft YaHei"/>
-          <w:sz w:val="21"/>
-        </w:rPr>
-        <w:t>今晚实际操作：打开 D:\医学统计学期末冲刺复习包\课程网站资料待放入\例02-01.sav，先看 Variable View，再切到 Data View。保存一张变量视图截图到 SPSS截图 文件夹。</w:t>
-      </w:r>
-    </w:p>
-    <w:p>
-      <w:pPr>
-        <w:pStyle w:val="Heading1"/>
-      </w:pPr>
-      <w:r>
-        <w:rPr>
-          <w:rFonts w:ascii="Microsoft YaHei" w:hAnsi="Microsoft YaHei" w:eastAsia="Microsoft YaHei"/>
-        </w:rPr>
-        <w:t>四、一页必背</w:t>
+        <w:t>8题：系统误差可通过设计和质量控制减少或避免；测量误差和抽样误差通常不可完全避免。</w:t>
       </w:r>
     </w:p>
     <w:p>
       <w:pPr>
         <w:pStyle w:val="ListBullet"/>
-        <w:spacing w:after="40"/>
       </w:pPr>
       <w:r>
         <w:rPr>
           <w:rFonts w:ascii="Microsoft YaHei" w:hAnsi="Microsoft YaHei" w:eastAsia="Microsoft YaHei"/>
-          <w:sz w:val="21"/>
+          <w:sz w:val="22"/>
         </w:rPr>
-        <w:t>总体要同质：同质=影响研究指标的因素相同或相近，不是所有个体完全一样。</w:t>
+        <w:t>10题：统计工作步骤是研究设计、搜集资料、整理资料、分析资料。</w:t>
+      </w:r>
+    </w:p>
+    <w:p/>
+    <w:p>
+      <w:pPr>
+        <w:pStyle w:val="Heading2"/>
+      </w:pPr>
+      <w:r>
+        <w:t>SPSS入门</w:t>
+      </w:r>
+    </w:p>
+    <w:p/>
+    <w:p>
+      <w:pPr>
+        <w:pStyle w:val="ListBullet"/>
+      </w:pPr>
+      <w:r>
+        <w:rPr>
+          <w:rFonts w:ascii="Microsoft YaHei" w:hAnsi="Microsoft YaHei" w:eastAsia="Microsoft YaHei"/>
+          <w:sz w:val="22"/>
+        </w:rPr>
+        <w:t>数据视图：一行一个研究对象，一列一个变量。</w:t>
       </w:r>
     </w:p>
     <w:p>
       <w:pPr>
         <w:pStyle w:val="ListBullet"/>
-        <w:spacing w:after="40"/>
       </w:pPr>
       <w:r>
         <w:rPr>
           <w:rFonts w:ascii="Microsoft YaHei" w:hAnsi="Microsoft YaHei" w:eastAsia="Microsoft YaHei"/>
-          <w:sz w:val="21"/>
+          <w:sz w:val="22"/>
         </w:rPr>
-        <w:t>样本来自总体，统计量来自样本，参数属于总体。样本统计量用于推断总体参数。</w:t>
+        <w:t>变量视图：定义变量属性。</w:t>
       </w:r>
     </w:p>
     <w:p>
       <w:pPr>
         <w:pStyle w:val="ListBullet"/>
-        <w:spacing w:after="40"/>
       </w:pPr>
       <w:r>
         <w:rPr>
           <w:rFonts w:ascii="Microsoft YaHei" w:hAnsi="Microsoft YaHei" w:eastAsia="Microsoft YaHei"/>
-          <w:sz w:val="21"/>
+          <w:sz w:val="22"/>
         </w:rPr>
-        <w:t>抽样误差=样本统计量与总体参数之差；随机抽样导致，不可完全避免，样本量增大可减小。</w:t>
+        <w:t>变量标签：变量的中文说明。</w:t>
       </w:r>
     </w:p>
     <w:p>
       <w:pPr>
         <w:pStyle w:val="ListBullet"/>
-        <w:spacing w:after="40"/>
       </w:pPr>
       <w:r>
         <w:rPr>
           <w:rFonts w:ascii="Microsoft YaHei" w:hAnsi="Microsoft YaHei" w:eastAsia="Microsoft YaHei"/>
-          <w:sz w:val="21"/>
+          <w:sz w:val="22"/>
         </w:rPr>
-        <w:t>系统误差=固定方向偏差；来自设计、选择、测量、混杂等，靠设计和质控减少。</w:t>
+        <w:t>值标签：分类变量的数字编码解释，例如 1=男，2=女。</w:t>
       </w:r>
     </w:p>
     <w:p>
       <w:pPr>
         <w:pStyle w:val="ListBullet"/>
-        <w:spacing w:after="40"/>
       </w:pPr>
       <w:r>
         <w:rPr>
           <w:rFonts w:ascii="Microsoft YaHei" w:hAnsi="Microsoft YaHei" w:eastAsia="Microsoft YaHei"/>
-          <w:sz w:val="21"/>
+          <w:sz w:val="22"/>
         </w:rPr>
-        <w:t>统计分析=统计描述 + 统计推断。统计工作=设计、搜集资料、整理资料、分析资料。</w:t>
-      </w:r>
-    </w:p>
-    <w:p>
-      <w:pPr>
-        <w:pStyle w:val="ListBullet"/>
-        <w:spacing w:after="40"/>
-      </w:pPr>
-      <w:r>
-        <w:rPr>
-          <w:rFonts w:ascii="Microsoft YaHei" w:hAnsi="Microsoft YaHei" w:eastAsia="Microsoft YaHei"/>
-          <w:sz w:val="21"/>
-        </w:rPr>
-        <w:t>SPSS数据视图：行是对象，列是变量。变量视图：Name英文/拼音，Label中文解释，Values写编码，Measure定资料类型。</w:t>
-      </w:r>
-    </w:p>
-    <w:p>
-      <w:pPr>
-        <w:pStyle w:val="ListBullet"/>
-        <w:spacing w:after="40"/>
-      </w:pPr>
-      <w:r>
-        <w:rPr>
-          <w:rFonts w:ascii="Microsoft YaHei" w:hAnsi="Microsoft YaHei" w:eastAsia="Microsoft YaHei"/>
-          <w:sz w:val="21"/>
-        </w:rPr>
-        <w:t>Measure速记：Scale计量，Nominal无序分类，Ordinal等级。</w:t>
-      </w:r>
-    </w:p>
-    <w:p>
-      <w:pPr>
-        <w:pStyle w:val="Heading1"/>
-      </w:pPr>
-      <w:r>
-        <w:rPr>
-          <w:rFonts w:ascii="Microsoft YaHei" w:hAnsi="Microsoft YaHei" w:eastAsia="Microsoft YaHei"/>
-        </w:rPr>
-        <w:t>五、自测口令</w:t>
-      </w:r>
-    </w:p>
-    <w:p>
-      <w:pPr>
-        <w:spacing w:after="80"/>
-      </w:pPr>
-      <w:r>
-        <w:rPr>
-          <w:rFonts w:ascii="Microsoft YaHei" w:hAnsi="Microsoft YaHei" w:eastAsia="Microsoft YaHei"/>
-          <w:sz w:val="21"/>
-        </w:rPr>
-        <w:t>看到一道题先问三句：研究对象是谁？研究指标是什么？题目要样本还是总体？看到SPSS变量先问三句：变量名是什么？编码是什么意思？资料类型是什么？</w:t>
-      </w:r>
-    </w:p>
-    <w:p>
-      <w:pPr>
-        <w:pStyle w:val="Heading1"/>
-      </w:pPr>
-      <w:r>
-        <w:rPr>
-          <w:rFonts w:ascii="Microsoft YaHei" w:hAnsi="Microsoft YaHei" w:eastAsia="Microsoft YaHei"/>
-          <w:b/>
-          <w:sz w:val="24"/>
-        </w:rPr>
-        <w:t>六、今日错题复盘</w:t>
+        <w:t>测量：</w:t>
       </w:r>
     </w:p>
     <w:p>
       <w:r>
         <w:rPr>
           <w:rFonts w:ascii="Microsoft YaHei" w:hAnsi="Microsoft YaHei" w:eastAsia="Microsoft YaHei"/>
-          <w:sz w:val="21"/>
+          <w:sz w:val="22"/>
         </w:rPr>
-        <w:t>今日错题：2、4、7、8、10。现在均已讲清楚并确认理解。</w:t>
+        <w:t xml:space="preserve">  - 标度 = Scale = 计量资料。</w:t>
       </w:r>
     </w:p>
     <w:p>
       <w:r>
         <w:rPr>
           <w:rFonts w:ascii="Microsoft YaHei" w:hAnsi="Microsoft YaHei" w:eastAsia="Microsoft YaHei"/>
-          <w:sz w:val="21"/>
+          <w:sz w:val="22"/>
         </w:rPr>
-        <w:t>2题：同质=影响研究指标的主要因素相同或相近。 错因：把“同质”误理解成完全相同或个体差异很小。</w:t>
+        <w:t xml:space="preserve">  - 名义 = Nominal = 无序分类资料。</w:t>
       </w:r>
     </w:p>
     <w:p>
       <w:r>
         <w:rPr>
           <w:rFonts w:ascii="Microsoft YaHei" w:hAnsi="Microsoft YaHei" w:eastAsia="Microsoft YaHei"/>
-          <w:sz w:val="21"/>
+          <w:sz w:val="22"/>
         </w:rPr>
-        <w:t>4题：抽样误差=样本统计量与总体参数之差。 错因：误把个体值和均数/参数的差当成抽样误差。</w:t>
+        <w:t xml:space="preserve">  - 有序 = Ordinal = 等级资料。</w:t>
+      </w:r>
+    </w:p>
+    <w:p/>
+    <w:p>
+      <w:pPr>
+        <w:pStyle w:val="Heading2"/>
+      </w:pPr>
+      <w:r>
+        <w:t>睡前必背</w:t>
+      </w:r>
+    </w:p>
+    <w:p/>
+    <w:p>
+      <w:pPr>
+        <w:pStyle w:val="ListBullet"/>
+      </w:pPr>
+      <w:r>
+        <w:rPr>
+          <w:rFonts w:ascii="Microsoft YaHei" w:hAnsi="Microsoft YaHei" w:eastAsia="Microsoft YaHei"/>
+          <w:sz w:val="22"/>
+        </w:rPr>
+        <w:t>样本统计量推总体参数。</w:t>
       </w:r>
     </w:p>
     <w:p>
+      <w:pPr>
+        <w:pStyle w:val="ListBullet"/>
+      </w:pPr>
       <w:r>
         <w:rPr>
           <w:rFonts w:ascii="Microsoft YaHei" w:hAnsi="Microsoft YaHei" w:eastAsia="Microsoft YaHei"/>
-          <w:sz w:val="21"/>
+          <w:sz w:val="22"/>
         </w:rPr>
-        <w:t>7题：概率=随机事件发生可能性的大小。 错因：“强度”不是概率的标准表述。</w:t>
+        <w:t>抽样误差 = 样本统计量与总体参数之差。</w:t>
       </w:r>
     </w:p>
     <w:p>
+      <w:pPr>
+        <w:pStyle w:val="ListBullet"/>
+      </w:pPr>
       <w:r>
         <w:rPr>
           <w:rFonts w:ascii="Microsoft YaHei" w:hAnsi="Microsoft YaHei" w:eastAsia="Microsoft YaHei"/>
-          <w:sz w:val="21"/>
+          <w:sz w:val="22"/>
         </w:rPr>
-        <w:t>8题：系统误差可控；测量误差和抽样误差通常难完全避免。 错因：混淆了系统误差与抽样误差的可避免性。</w:t>
+        <w:t>统计工作四步 = 设计、搜集、整理、分析。</w:t>
       </w:r>
     </w:p>
     <w:p>
+      <w:pPr>
+        <w:pStyle w:val="ListBullet"/>
+      </w:pPr>
       <w:r>
         <w:rPr>
           <w:rFonts w:ascii="Microsoft YaHei" w:hAnsi="Microsoft YaHei" w:eastAsia="Microsoft YaHei"/>
-          <w:sz w:val="21"/>
+          <w:sz w:val="22"/>
         </w:rPr>
-        <w:t>10题：统计工作步骤=设计、搜集、整理、分析。 错因：把调查/试验或统计描述/推断当成完整工作步骤。</w:t>
+        <w:t>统计分析两块 = 统计描述 + 统计推断。</w:t>
       </w:r>
     </w:p>
     <w:p>
+      <w:pPr>
+        <w:pStyle w:val="ListBullet"/>
+      </w:pPr>
       <w:r>
         <w:rPr>
           <w:rFonts w:ascii="Microsoft YaHei" w:hAnsi="Microsoft YaHei" w:eastAsia="Microsoft YaHei"/>
-          <w:sz w:val="21"/>
+          <w:sz w:val="22"/>
         </w:rPr>
-        <w:t>最后再记：统计工作步骤=设计、搜集、整理、分析；统计分析内容=统计描述、统计推断。</w:t>
+        <w:t>SPSS测量：标度=计量，名义=无序分类，有序=等级。</w:t>
       </w:r>
     </w:p>
+    <w:p/>
     <w:sectPr>
       <w:pgSz w:w="12240" w:h="15840"/>
-      <w:pgMar w:top="936" w:right="1080" w:bottom="936" w:left="1080" w:header="720" w:footer="720" w:gutter="0"/>
+      <w:pgMar w:top="1440" w:right="1800" w:bottom="1440" w:left="1800" w:header="720" w:footer="720" w:gutter="0"/>
       <w:cols w:space="720"/>
       <w:docGrid w:linePitch="360"/>
     </w:sectPr>
@@ -1171,7 +679,7 @@
     <w:rsid w:val="00FC693F"/>
     <w:rPr>
       <w:rFonts w:ascii="Microsoft YaHei" w:hAnsi="Microsoft YaHei" w:eastAsia="Microsoft YaHei"/>
-      <w:sz w:val="21"/>
+      <w:sz w:val="22"/>
     </w:rPr>
   </w:style>
   <w:style w:type="paragraph" w:styleId="Header">

</xml_diff>